<commit_message>
Heladería EN, revisión D203: entregables remontados, gates en verde y REVISION-FINAL (0 B · 5 M · 12 m)
Remontado en el VPS: G1-G9 VERDE, autotests 20/20 y 8/8, barrido 1,383 piezas sin fallos, regresión 31/31 IGUAL,
2.ª pasada con sha256 canónico igual, Word de 24 págs. Letter. Volcados de revision/ regenerados.

Via: Claude Code
Co-Authored-By: Claude Opus 5.5 <noreply@anthropic.com>
</commit_message>
<xml_diff>
--- a/astro-site/public/dl/ice-cream-shop-business-plan/ice-cream-shop-business-plan.docx
+++ b/astro-site/public/dl/ice-cream-shop-business-plan/ice-cream-shop-business-plan.docx
@@ -377,7 +377,7 @@
     </w:p>
     <w:p>
       <w:r>
-        <w:t>Winter is part of the concept, not a pause. There is no equipment that needs a smoke exhaust: the shop runs on ice cream cakes to order, holiday pies and pints, hot chocolate and catering, and it closes three weeks in January and on Mondays from November to February. With that menu the shop stays alive, the year-round team has work and the summer cash is not spent entirely before spring.</w:t>
+        <w:t>Winter is part of the concept, not a pause. The winter menu needs no cooking line: the shop runs on ice cream cakes to order, holiday pies and pints, hot chocolate and catering, and it closes three weeks in January and on Mondays from November to February. With that menu the shop stays alive, the year-round team has work and the summer cash is not spent entirely before spring.</w:t>
       </w:r>
     </w:p>
     <w:p>
@@ -399,7 +399,7 @@
     </w:p>
     <w:p>
       <w:r>
-        <w:t>Demand for ice cream in the United States is large and strongly seasonal. According to the International Dairy Foods Association (IDFA), July is the month with the most ice cream production, and the country dedicates a whole month to it: in 1984, Presidential Proclamation 5219 declared July National Ice Cream Month and the third Sunday of July National Ice Cream Day. Your market is not the pint people buy at the supermarket, but the ice cream they prefer to buy fresh, at the counter, from someone who makes it. This plan does not use household consumption figures it could not verify: replace them with what you see on your own street.</w:t>
+        <w:t>Demand for ice cream in the United States is large and strongly seasonal. According to the International Dairy Foods Association (IDFA), July is the month with the most ice cream production, and the country dedicates a whole month to it: in 1984, Presidential Proclamation 5219 declared July National Ice Cream Month and July 15, that year's third Sunday, National Ice Cream Day, which the industry has celebrated on the third Sunday of July ever since. Your market is not the pint people buy at the supermarket, but the ice cream they prefer to buy fresh, at the counter, from someone who makes it. This plan does not use household consumption figures it could not verify: replace them with what you see on your own street.</w:t>
       </w:r>
     </w:p>
     <w:p>
@@ -461,7 +461,7 @@
     </w:p>
     <w:p>
       <w:r>
-        <w:t>The barriers to entry are compliance and cash. The first is the license decision: buying a pasteurized base from a licensed dairy usually makes you a retail food establishment, while making your own mix means a state dairy plant or frozen dessert manufacturer license and 3-A equipment. It depends on your state: ask your state department of agriculture and your local health department before you buy equipment. The health permit comes after plan review and an inspection, and the patio needs its own sidewalk café permit. And cash weighs: the machines, the furniture and the equipment of the case add up to a large part of the $204,100 of startup costs. Confirm each step with your city, your county and your CPA.</w:t>
+        <w:t>The barriers to entry are compliance and cash. The first is the license decision: buying a pasteurized base from a licensed dairy is the lighter route (your retail food permit and, in some states, a frozen dessert license), while making your own mix means a state dairy plant or frozen dessert manufacturer license and 3-A equipment. It depends on your state: ask your state department of agriculture and your local health department before you buy equipment. The health permit comes after plan review and an inspection, and the patio needs its own sidewalk café permit. And cash weighs: the machines, the furniture and the equipment of the case add up to a large part of the $204,100 of startup costs. Confirm each step with your city, your county and your CPA.</w:t>
       </w:r>
     </w:p>
     <w:p>
@@ -545,7 +545,7 @@
     </w:p>
     <w:p>
       <w:r>
-        <w:t>A production day always follows the same order, and that order is a food safety matter, not a matter of taste. You receive the pasteurized base from your licensed dairy at 41 °F (5 °C) or colder and write down the lot code. Then you flavor it and fold in the mix-ins; after the dairy's pasteurization you add only flavorings and mix-ins, with no raw eggs and no raw milk or cream, and custard flavors come from a custard base. Next the mix goes through the batch freezer, where it is drawn at about 16-19 °F, and then into the hardening cabinet until it reaches 0 °F (−18 °C) or colder at the core. It is stored at 0 °F or colder and served from the dipping cabinet at 6-10 °F, depending on the manufacturer. Date-mark every tub (Food Code 3-501.17) and note each batch with its date, lot code and temperatures: that log is the backbone of your written food safety plan. If you decide to pasteurize your own mix, which is the variant and needs a state license and other equipment, fats, egg yolks and emulsifiers go in before pasteurization, never after.</w:t>
+        <w:t>A production day always follows the same order, and that order is a food safety matter, not a matter of taste. You receive the pasteurized base from your licensed dairy at 41 °F (5 °C) or colder and write down the lot code. Then you flavor it and fold in the mix-ins; after the dairy's pasteurization you add only flavorings and mix-ins, with no raw eggs and no raw milk or cream, and custard flavors come from a custard base. Next the mix goes through the batch freezer, where it is drawn at about 16-19 °F, and then into the hardening cabinet until it reaches 0 °F (−18 °C) or colder at the core. It is stored at 0 °F or colder and served from the dipping cabinet at 6-10 °F, depending on the manufacturer. Date-mark the base when you open it (Food Code 3-501.17), label every tub with its batch date and note each batch with its date, lot code and temperatures: that log is the backbone of your written food safety plan. If you decide to pasteurize your own mix, which is the variant and needs a state license and other equipment, fats, egg yolks and emulsifiers go in before pasteurization, never after.</w:t>
       </w:r>
     </w:p>
     <w:p>
@@ -592,12 +592,12 @@
     </w:p>
     <w:p>
       <w:r>
-        <w:t>That team adds up to 3.05 full-time equivalents and costs $128,185 in year 1, including employer payroll taxes of 10%: 33.4% of sales. It is the biggest expense of the business, above the rent, so it pays to measure it well. The schedule covers 105% of the hours the shop needs: you cover what is needed, with no surplus. The plan budgets $15 an hour or more and does not model tips. In years 2 and 3 the payroll grows with people you add on the "Staffing" tab, not with a percentage. Look at that percentage calmly: in an ice cream shop, labor is the lever that weighs most on the result, and every counter hour that does not sell is paid just the same. That is why the seasonal staff come in only when the season needs them, and the owner covers with their own work the more technical hours in the production room.</w:t>
+        <w:t>That team adds up to 3.05 full-time equivalents and costs $128,185 in year 1, including employer payroll taxes of 10%: 33.4% of sales. It is the biggest expense of the business, above the rent, so it pays to measure it well. The schedule covers 105% of the hours the shop needs: you cover what is needed, with a small margin. The plan budgets $15 an hour or more and does not model tips. In years 2 and 3 the payroll grows with people you add on the "Staffing" tab, not with a percentage. Look at that percentage calmly: in an ice cream shop, labor is the lever that weighs most on the result, and every counter hour that does not sell is paid just the same. That is why the seasonal staff come in only when the season needs them, and the owner covers with their own work the more technical hours in the production room.</w:t>
       </w:r>
     </w:p>
     <w:p>
       <w:r>
-        <w:t>Seasonal staff are hired as seasonal part-time W-2 employees, with an offer letter that states the expected start and end of the season, and rehired every spring. They are covered by workers' compensation and by state unemployment insurance like any other employee. It is not a one-season relationship: the person does not disappear in October, comes back when you call, and that helps you keep the craft you have trained. Think of it as an investment: someone who already knows how to serve without mixing flavors and how to work the cabinets saves you mistakes and waste in July.</w:t>
+        <w:t>Seasonal staff are hired as seasonal W-2 employees, with an offer letter that states the expected start and end of the season, and rehired every spring. They are covered by workers' compensation and by state unemployment insurance like any other employee. It is not a one-season relationship: the person does not disappear in October, comes back when you call, and that helps you keep the craft you have trained. Think of it as an investment: someone who already knows how to serve without mixing flavors and how to work the cabinets saves you mistakes and waste in July.</w:t>
       </w:r>
     </w:p>
     <w:p>
@@ -612,7 +612,7 @@
     </w:p>
     <w:p>
       <w:r>
-        <w:t>Train the team before opening. At least one person needs the Certified Food Protection Manager certification (Food Code 2-102.12) and the others a food handler card where your state requires one, covering temperatures, allergens and the order of the production day. Besides that, the ice cream maker needs technical training in mix balancing, because a badly balanced recipe gives an icy or hard ice cream. And count on OSHA basics: cold, lifting and cuts are the typical accidents of a production room. Schedule a short refresher at the start of each season, when the seasonal staff return, because what is not repeated is forgotten; that way everyone who arrives in April already knows the order of the production room and the allergens of each flavor.</w:t>
+        <w:t>Train the team before opening. The person in charge of each shift needs the Certified Food Protection Manager certification (Food Code 2022, 2-102.12; states still on an older edition ask for at least one certified manager), and the others a food handler card where your state requires one, covering temperatures, allergens and the order of the production day. Besides that, the ice cream maker needs technical training in mix balancing, because a badly balanced recipe gives an icy or hard ice cream. And count on OSHA basics: cold, lifting and cuts are the typical accidents of a production room. Schedule a short refresher at the start of each season, when the seasonal staff return, because what is not repeated is forgotten; that way everyone who arrives in April already knows the order of the production room and the allergens of each flavor.</w:t>
       </w:r>
     </w:p>
     <w:p>
@@ -696,12 +696,12 @@
     </w:p>
     <w:p>
       <w:r>
-        <w:t>The license decision comes first, and it depends on your state. Buying pasteurized base from a licensed dairy generally keeps you a retail food establishment in most states, while making your own mix usually adds a state dairy plant or frozen dessert manufacturer license, 3-A equipment and inspections. In Vermont, for example, the Agency of Agriculture treats a pasteurized base as a retail frozen dessert license and allows only flavorings after pasteurization, while blending your own mix needs a Milk Handler License; in Georgia, a retailer that freezes a mix from a licensed dairy does not need a dairy manufacturer's license. Arizona, Massachusetts and Pennsylvania treat it differently, so check. Ask your state department of agriculture in writing before you sign the lease, and then apply for your health permit with your local health department.</w:t>
+        <w:t>The license decision comes first, and it depends on your state. Buying pasteurized base from a licensed dairy is the lighter route, while making your own mix usually adds a state dairy plant or frozen dessert manufacturer license, 3-A equipment and inspections. In Vermont, for example, freezing a pasteurized base needs a Frozen Dessert License from the Agency of Agriculture, and only flavorings may be added after pasteurization, while blending your own mix needs a Milk Handler License. In Georgia, a retailer that freezes a mix from a licensed dairy processor is exempt from the Dairy Manufacturer's License only for ice cream eaten on the premises: ask before you sell pints to go, delivery or catering. Arizona, Massachusetts and Pennsylvania treat it differently, so check. Ask your state department of agriculture in writing before you sign the lease, and then apply for your health permit with your local health department.</w:t>
       </w:r>
     </w:p>
     <w:p>
       <w:r>
-        <w:t>Your food safety plan is built on the FDA Food Code as your state has adopted it. At least one person holds the Certified Food Protection Manager certification (2-102.12), and food handler cards apply depending on your state. Dipper wells have running water (3-304.12), cold holding is 41 °F (5 °C) or colder, storage is at 0 °F or colder and every tub is date-marked (3-501.17). Pints you package in the shop need a label (3-602.11). The case uses no raw egg, because the base is a pasteurized base from a licensed dairy. Ice cream that melts is never refrozen, and your plan, not a national rule, sets the cabinet temperature together with the manufacturer's specification. Your local health department has the final word on how it applies to you.</w:t>
+        <w:t>Your food safety plan is built on the FDA Food Code as your state has adopted it. The person in charge holds the Certified Food Protection Manager certification (2-102.12 in the 2022 Food Code; older editions ask for at least one certified manager), and food handler cards apply depending on your state. Dipper wells have running water (3-304.12), cold holding is 41 °F (5 °C) or colder, storage is at 0 °F or colder and the base is date-marked when opened (3-501.17), with every tub labeled with its batch date. Pints you package in the shop need a label (3-602.11). The case uses no raw egg, because the base is a pasteurized base from a licensed dairy. Ice cream that melts is never refrozen, and your plan, not a national rule, sets the cabinet temperature together with the manufacturer's specification. Your local health department has the final word on how it applies to you.</w:t>
       </w:r>
     </w:p>
     <w:p>

</xml_diff>